<commit_message>
Add a Sources and go deeper block to every room and download.
Each room, chapter, section export, cheat sheet, template, flashcard, and diagram page now ends with links opened in October 2026. Every room keeps sources.json. A page that 404s or lands on a different article is marked confirm.

Co-authored-by: CYPHER0X9 <cipher0x9@users.noreply.github.com>
</commit_message>
<xml_diff>
--- a/downloads/templates/cutover-checklist.docx
+++ b/downloads/templates/cutover-checklist.docx
@@ -142,6 +142,60 @@
         <w:t xml:space="preserve">Caution: A spreadsheet that says 'like for like' with no formulas.</w:t>
       </w:r>
     </w:p>
+    <w:p>
+      <w:r>
+        <w:rPr/>
+        <w:t xml:space="preserve">Sources and go deeper</w:t>
+      </w:r>
+    </w:p>
+    <w:p>
+      <w:r>
+        <w:rPr/>
+        <w:t xml:space="preserve">Set up your network to use the Connect Customer Contact Control Panel (CCP) - Amazon Connect Customer (AWS docs) https://docs.aws.amazon.com/connect/latest/adminguide/ccp-networking.html last checked 2026-10</w:t>
+      </w:r>
+    </w:p>
+    <w:p>
+      <w:r>
+        <w:rPr/>
+        <w:t xml:space="preserve">How Connect Customer uses routing profiles - Amazon Connect Customer (AWS docs) https://docs.aws.amazon.com/connect/latest/adminguide/concepts-routing.html last checked 2026-10</w:t>
+      </w:r>
+    </w:p>
+    <w:p>
+      <w:r>
+        <w:rPr/>
+        <w:t xml:space="preserve">The voice channel in Connect Customer - Amazon Connect Customer (AWS docs) https://docs.aws.amazon.com/connect/latest/adminguide/concepts-telephony.html last checked 2026-10</w:t>
+      </w:r>
+    </w:p>
+    <w:p>
+      <w:r>
+        <w:rPr/>
+        <w:t xml:space="preserve">RFC 3261: SIP: Session Initiation Protocol | RFC Editor (RFC) https://www.rfc-editor.org/info/rfc3261/ last checked 2026-10</w:t>
+      </w:r>
+    </w:p>
+    <w:p>
+      <w:r>
+        <w:rPr/>
+        <w:t xml:space="preserve">Call centre - Wikipedia (Wikipedia) https://en.wikipedia.org/wiki/Call_centre last checked 2026-10</w:t>
+      </w:r>
+    </w:p>
+    <w:p>
+      <w:r>
+        <w:rPr/>
+        <w:t xml:space="preserve">Session Initiation Protocol - Wikipedia (Wikipedia) https://en.wikipedia.org/wiki/Session_Initiation_Protocol last checked 2026-10</w:t>
+      </w:r>
+    </w:p>
+    <w:p>
+      <w:r>
+        <w:rPr/>
+        <w:t xml:space="preserve">confirm. Cisco Unified Communications Manager (Wikipedia) https://en.wikipedia.org/wiki/Cisco_Unified_Communications_Manager last checked 2026-10. Opened 2026-10. HTTP 404.</w:t>
+      </w:r>
+    </w:p>
+    <w:p>
+      <w:r>
+        <w:rPr/>
+        <w:t xml:space="preserve">Flow block in Connect Customer: Transfer to phone number - Amazon Connect Customer (AWS docs) https://docs.aws.amazon.com/connect/latest/adminguide/transfer-to-phone-number.html last checked 2026-10</w:t>
+      </w:r>
+    </w:p>
   </w:body>
 </w:document>
 </file>
</xml_diff>